<commit_message>
feat: add S&I/Laos channels, Prorate & SpecialAdjust pages, update test scenarios
- Deploy usp_run_si_incentive_calculation & usp_run_laos_incentive_calculation
- Setup S&I (SI001-SI003, SIM01) and Laos (LA001-LA003, LAM01, LAD01) test data
- Add DDL: trn_prorate_adjustment + trn_special_adjustment tables
- Add Razor Pages: /Prorate/Index and /SpecialAdjust/Index
- Add Adjustments dropdown nav menu (Prorate Logic + Special Adjustment)
- Add adj-* CSS classes to site.css
- Update test scenarios TC03-TC06 to full execution tests (no more skip-by-capability)
- Add Invoke-LaosProc to runner; TC03/TC04 verify expected amounts; TC05/TC06 CRUD cycle
- Test runner result: PASS=6, WARN=0, FAIL=0
</commit_message>
<xml_diff>
--- a/1.General Documents/Sales Incentive System for POC 05-06-26.docx
+++ b/1.General Documents/Sales Incentive System for POC 05-06-26.docx
@@ -3214,12 +3214,23 @@
       <w:pPr>
         <w:pStyle w:val="Heading1"/>
       </w:pPr>
-      <w:r>
-        <w:t>Function 4 — Special Adjustment</w:t>
-      </w:r>
     </w:p>
     <w:p>
       <w:pPr>
+        <w:pStyle w:val="Heading1"/>
+      </w:pPr>
+    </w:p>
+    <w:p>
+      <w:pPr>
+        <w:pStyle w:val="Heading1"/>
+      </w:pPr>
+      <w:r>
+        <w:lastRenderedPageBreak/>
+        <w:t>Function 4 — Special Adjustment</w:t>
+      </w:r>
+    </w:p>
+    <w:p>
+      <w:pPr>
         <w:spacing w:before="60" w:after="60"/>
         <w:rPr>
           <w:rFonts w:cstheme="minorBidi"/>
@@ -3281,7 +3292,6 @@
         <w:pStyle w:val="Heading2"/>
       </w:pPr>
       <w:r>
-        <w:lastRenderedPageBreak/>
         <w:t xml:space="preserve">4.1 </w:t>
       </w:r>
       <w:proofErr w:type="spellStart"/>
@@ -3941,10 +3951,13 @@
     <w:p>
       <w:pPr>
         <w:pStyle w:val="Heading2"/>
-      </w:pPr>
-      <w:r>
-        <w:rPr>
-          <w:highlight w:val="green"/>
+        <w:rPr>
+          <w:color w:val="auto"/>
+        </w:rPr>
+      </w:pPr>
+      <w:r>
+        <w:rPr>
+          <w:color w:val="auto"/>
         </w:rPr>
         <w:t xml:space="preserve">Scenario 1 — </w:t>
       </w:r>
@@ -3952,27 +3965,27 @@
       <w:r>
         <w:rPr>
           <w:rFonts w:ascii="Browallia New" w:hAnsi="Browallia New" w:cs="Browallia New"/>
-          <w:highlight w:val="green"/>
+          <w:color w:val="auto"/>
         </w:rPr>
         <w:t>พนักงานปกติ</w:t>
       </w:r>
       <w:proofErr w:type="spellEnd"/>
       <w:r>
         <w:rPr>
-          <w:highlight w:val="green"/>
+          <w:color w:val="auto"/>
         </w:rPr>
         <w:t xml:space="preserve"> TT Channel</w:t>
       </w:r>
       <w:r>
         <w:rPr>
-          <w:highlight w:val="green"/>
+          <w:color w:val="auto"/>
         </w:rPr>
         <w:t xml:space="preserve"> (</w:t>
       </w:r>
       <w:r>
         <w:rPr>
           <w:rFonts w:cstheme="minorBidi" w:hint="cs"/>
-          <w:highlight w:val="green"/>
+          <w:color w:val="auto"/>
           <w:cs/>
         </w:rPr>
         <w:t>ทุก</w:t>
@@ -3980,7 +3993,7 @@
       <w:r>
         <w:rPr>
           <w:rFonts w:cstheme="minorBidi"/>
-          <w:highlight w:val="green"/>
+          <w:color w:val="auto"/>
         </w:rPr>
         <w:t xml:space="preserve"> Layer Sales(Deputy Depot </w:t>
       </w:r>
@@ -3988,7 +4001,7 @@
       <w:r>
         <w:rPr>
           <w:rFonts w:cstheme="minorBidi"/>
-          <w:highlight w:val="green"/>
+          <w:color w:val="auto"/>
         </w:rPr>
         <w:t>cho</w:t>
       </w:r>
@@ -3996,7 +4009,7 @@
       <w:r>
         <w:rPr>
           <w:rFonts w:cstheme="minorBidi"/>
-          <w:highlight w:val="green"/>
+          <w:color w:val="auto"/>
         </w:rPr>
         <w:t xml:space="preserve">) &gt; Depot </w:t>
       </w:r>
@@ -4004,14 +4017,14 @@
       <w:r>
         <w:rPr>
           <w:rFonts w:cstheme="minorBidi"/>
-          <w:highlight w:val="green"/>
+          <w:color w:val="auto"/>
         </w:rPr>
         <w:t>cho</w:t>
       </w:r>
       <w:proofErr w:type="spellEnd"/>
       <w:r>
         <w:rPr>
-          <w:highlight w:val="green"/>
+          <w:color w:val="auto"/>
         </w:rPr>
         <w:t xml:space="preserve"> &gt; Area Manager &gt; Division &gt; AD)</w:t>
       </w:r>
@@ -4020,12 +4033,12 @@
       <w:pPr>
         <w:pStyle w:val="Heading2"/>
         <w:rPr>
-          <w:highlight w:val="yellow"/>
-        </w:rPr>
-      </w:pPr>
-      <w:r>
-        <w:rPr>
-          <w:highlight w:val="yellow"/>
+          <w:color w:val="auto"/>
+        </w:rPr>
+      </w:pPr>
+      <w:r>
+        <w:rPr>
+          <w:color w:val="auto"/>
         </w:rPr>
         <w:t xml:space="preserve">Scenario 2 — </w:t>
       </w:r>
@@ -4033,21 +4046,21 @@
       <w:r>
         <w:rPr>
           <w:rFonts w:ascii="Browallia New" w:hAnsi="Browallia New" w:cs="Browallia New"/>
-          <w:highlight w:val="yellow"/>
+          <w:color w:val="auto"/>
         </w:rPr>
         <w:t>พนักงานปกติ</w:t>
       </w:r>
       <w:proofErr w:type="spellEnd"/>
       <w:r>
         <w:rPr>
-          <w:highlight w:val="yellow"/>
+          <w:color w:val="auto"/>
         </w:rPr>
         <w:t xml:space="preserve"> MT Channel (</w:t>
       </w:r>
       <w:r>
         <w:rPr>
           <w:rFonts w:cstheme="minorBidi" w:hint="cs"/>
-          <w:highlight w:val="yellow"/>
+          <w:color w:val="auto"/>
           <w:cs/>
         </w:rPr>
         <w:t>ทุก</w:t>
@@ -4055,26 +4068,26 @@
       <w:r>
         <w:rPr>
           <w:rFonts w:cstheme="minorBidi"/>
-          <w:highlight w:val="yellow"/>
+          <w:color w:val="auto"/>
         </w:rPr>
         <w:t xml:space="preserve"> Layer Sales &gt; Section Manager</w:t>
       </w:r>
       <w:r>
         <w:rPr>
-          <w:highlight w:val="yellow"/>
+          <w:color w:val="auto"/>
         </w:rPr>
         <w:t xml:space="preserve"> &gt; </w:t>
       </w:r>
       <w:r>
         <w:rPr>
           <w:rFonts w:cstheme="minorBidi"/>
-          <w:highlight w:val="yellow"/>
+          <w:color w:val="auto"/>
         </w:rPr>
         <w:t>Department Manager</w:t>
       </w:r>
       <w:r>
         <w:rPr>
-          <w:highlight w:val="yellow"/>
+          <w:color w:val="auto"/>
         </w:rPr>
         <w:t xml:space="preserve"> &gt;Division &gt; AD)</w:t>
       </w:r>
@@ -4083,12 +4096,12 @@
       <w:pPr>
         <w:pStyle w:val="Heading2"/>
         <w:rPr>
-          <w:highlight w:val="yellow"/>
-        </w:rPr>
-      </w:pPr>
-      <w:r>
-        <w:rPr>
-          <w:highlight w:val="yellow"/>
+          <w:color w:val="auto"/>
+        </w:rPr>
+      </w:pPr>
+      <w:r>
+        <w:rPr>
+          <w:color w:val="auto"/>
         </w:rPr>
         <w:t xml:space="preserve">Scenario 3 — </w:t>
       </w:r>
@@ -4096,21 +4109,21 @@
       <w:r>
         <w:rPr>
           <w:rFonts w:ascii="Browallia New" w:hAnsi="Browallia New" w:cs="Browallia New"/>
-          <w:highlight w:val="yellow"/>
+          <w:color w:val="auto"/>
         </w:rPr>
         <w:t>พนักงานปกติ</w:t>
       </w:r>
       <w:proofErr w:type="spellEnd"/>
       <w:r>
         <w:rPr>
-          <w:highlight w:val="yellow"/>
+          <w:color w:val="auto"/>
         </w:rPr>
         <w:t xml:space="preserve"> S&amp;I Channel (</w:t>
       </w:r>
       <w:r>
         <w:rPr>
           <w:rFonts w:cstheme="minorBidi" w:hint="cs"/>
-          <w:highlight w:val="yellow"/>
+          <w:color w:val="auto"/>
           <w:cs/>
         </w:rPr>
         <w:t>ทุก</w:t>
@@ -4118,26 +4131,26 @@
       <w:r>
         <w:rPr>
           <w:rFonts w:cstheme="minorBidi"/>
-          <w:highlight w:val="yellow"/>
+          <w:color w:val="auto"/>
         </w:rPr>
         <w:t xml:space="preserve"> Layer Sales &gt; Section Manager</w:t>
       </w:r>
       <w:r>
         <w:rPr>
-          <w:highlight w:val="yellow"/>
+          <w:color w:val="auto"/>
         </w:rPr>
         <w:t xml:space="preserve"> &gt; </w:t>
       </w:r>
       <w:r>
         <w:rPr>
           <w:rFonts w:cstheme="minorBidi"/>
-          <w:highlight w:val="yellow"/>
+          <w:color w:val="auto"/>
         </w:rPr>
         <w:t>Department Manager</w:t>
       </w:r>
       <w:r>
         <w:rPr>
-          <w:highlight w:val="yellow"/>
+          <w:color w:val="auto"/>
         </w:rPr>
         <w:t xml:space="preserve"> &gt;Division )</w:t>
       </w:r>
@@ -4146,12 +4159,12 @@
       <w:pPr>
         <w:pStyle w:val="Heading2"/>
         <w:rPr>
-          <w:highlight w:val="green"/>
-        </w:rPr>
-      </w:pPr>
-      <w:r>
-        <w:rPr>
-          <w:highlight w:val="green"/>
+          <w:color w:val="auto"/>
+        </w:rPr>
+      </w:pPr>
+      <w:r>
+        <w:rPr>
+          <w:color w:val="auto"/>
         </w:rPr>
         <w:t xml:space="preserve">Scenario 4 — </w:t>
       </w:r>
@@ -4159,21 +4172,21 @@
       <w:r>
         <w:rPr>
           <w:rFonts w:ascii="Browallia New" w:hAnsi="Browallia New" w:cs="Browallia New"/>
-          <w:highlight w:val="green"/>
+          <w:color w:val="auto"/>
         </w:rPr>
         <w:t>พนักงานปกติ</w:t>
       </w:r>
       <w:proofErr w:type="spellEnd"/>
       <w:r>
         <w:rPr>
-          <w:highlight w:val="green"/>
+          <w:color w:val="auto"/>
         </w:rPr>
         <w:t xml:space="preserve"> Laos Channel (</w:t>
       </w:r>
       <w:r>
         <w:rPr>
           <w:rFonts w:cstheme="minorBidi" w:hint="cs"/>
-          <w:highlight w:val="green"/>
+          <w:color w:val="auto"/>
           <w:cs/>
         </w:rPr>
         <w:t>ทุก</w:t>
@@ -4181,26 +4194,26 @@
       <w:r>
         <w:rPr>
           <w:rFonts w:cstheme="minorBidi"/>
-          <w:highlight w:val="green"/>
+          <w:color w:val="auto"/>
         </w:rPr>
         <w:t xml:space="preserve"> Layer Sales &gt; Section Manager</w:t>
       </w:r>
       <w:r>
         <w:rPr>
-          <w:highlight w:val="green"/>
+          <w:color w:val="auto"/>
         </w:rPr>
         <w:t xml:space="preserve"> &gt; </w:t>
       </w:r>
       <w:r>
         <w:rPr>
           <w:rFonts w:cstheme="minorBidi"/>
-          <w:highlight w:val="green"/>
+          <w:color w:val="auto"/>
         </w:rPr>
         <w:t>Department Manager</w:t>
       </w:r>
       <w:r>
         <w:rPr>
-          <w:highlight w:val="green"/>
+          <w:color w:val="auto"/>
         </w:rPr>
         <w:t xml:space="preserve">  &gt; AD)</w:t>
       </w:r>
@@ -4209,24 +4222,24 @@
       <w:pPr>
         <w:pStyle w:val="Heading2"/>
         <w:rPr>
-          <w:highlight w:val="yellow"/>
-        </w:rPr>
-      </w:pPr>
-      <w:r>
-        <w:rPr>
-          <w:highlight w:val="yellow"/>
+          <w:color w:val="auto"/>
+        </w:rPr>
+      </w:pPr>
+      <w:r>
+        <w:rPr>
+          <w:color w:val="auto"/>
         </w:rPr>
         <w:t xml:space="preserve">Scenario </w:t>
       </w:r>
       <w:r>
         <w:rPr>
-          <w:highlight w:val="yellow"/>
+          <w:color w:val="auto"/>
         </w:rPr>
         <w:t>5</w:t>
       </w:r>
       <w:r>
         <w:rPr>
-          <w:highlight w:val="yellow"/>
+          <w:color w:val="auto"/>
         </w:rPr>
         <w:t xml:space="preserve"> — </w:t>
       </w:r>
@@ -4234,7 +4247,7 @@
       <w:r>
         <w:rPr>
           <w:rFonts w:ascii="Browallia New" w:hAnsi="Browallia New" w:cs="Browallia New"/>
-          <w:highlight w:val="yellow"/>
+          <w:color w:val="auto"/>
         </w:rPr>
         <w:t>พนักงานเข้างานกลางเดือน</w:t>
       </w:r>
@@ -4242,7 +4255,7 @@
       <w:r>
         <w:rPr>
           <w:rFonts w:ascii="Browallia New" w:hAnsi="Browallia New" w:cs="Browallia New"/>
-          <w:highlight w:val="yellow"/>
+          <w:color w:val="auto"/>
         </w:rPr>
         <w:t xml:space="preserve"> (Prorate)</w:t>
       </w:r>
@@ -4250,22 +4263,25 @@
     <w:p>
       <w:pPr>
         <w:pStyle w:val="Heading2"/>
-      </w:pPr>
-      <w:r>
-        <w:rPr>
-          <w:highlight w:val="yellow"/>
+        <w:rPr>
+          <w:color w:val="auto"/>
+        </w:rPr>
+      </w:pPr>
+      <w:r>
+        <w:rPr>
+          <w:color w:val="auto"/>
         </w:rPr>
         <w:t xml:space="preserve">Scenario </w:t>
       </w:r>
       <w:r>
         <w:rPr>
-          <w:highlight w:val="yellow"/>
+          <w:color w:val="auto"/>
         </w:rPr>
         <w:t>6</w:t>
       </w:r>
       <w:r>
         <w:rPr>
-          <w:highlight w:val="yellow"/>
+          <w:color w:val="auto"/>
         </w:rPr>
         <w:t xml:space="preserve"> — Special Adjustment</w:t>
       </w:r>

</xml_diff>